<commit_message>
Add new accelerated image processing project and updated resume
</commit_message>
<xml_diff>
--- a/public/meta/ben_safigan_resume.docx
+++ b/public/meta/ben_safigan_resume.docx
@@ -12,8 +12,17 @@
           <w:b/>
           <w:sz w:val="26"/>
         </w:rPr>
-        <w:t>Benedikt "Ben" Safigan</w:t>
+        <w:t xml:space="preserve">Benedikt "Ben" </w:t>
       </w:r>
+      <w:proofErr w:type="spellStart"/>
+      <w:r>
+        <w:rPr>
+          <w:b/>
+          <w:sz w:val="26"/>
+        </w:rPr>
+        <w:t>Safigan</w:t>
+      </w:r>
+      <w:proofErr w:type="spellEnd"/>
     </w:p>
     <w:p>
       <w:pPr>
@@ -79,7 +88,7 @@
         <w:spacing w:after="120"/>
       </w:pPr>
       <w:r>
-        <w:t>Computer Science student at CU Boulder, minoring in Computer Engineering, with hands-on professional internship experience in software development. Skilled across the full stack, from low-level embedded systems to React/Node.js web applications, with additional experience in data science tooling and DevOps. Proven ability to deliver with a passion for working close to the software-hardware boundary.</w:t>
+        <w:t>CS student at CU Boulder with hands-on, full-stack internship experience, from low-level embedded systems to React/Node.js web applications.</w:t>
       </w:r>
     </w:p>
     <w:p>
@@ -98,6 +107,9 @@
     </w:p>
     <w:p>
       <w:pPr>
+        <w:tabs>
+          <w:tab w:val="right" w:pos="10080"/>
+        </w:tabs>
         <w:spacing w:after="20" w:line="240" w:lineRule="auto"/>
       </w:pPr>
       <w:r>
@@ -105,10 +117,45 @@
           <w:b/>
           <w:sz w:val="20"/>
         </w:rPr>
-        <w:t>Software Engineer (Contractor) | GovWorx</w:t>
+        <w:t xml:space="preserve">Software Engineer (Contractor) | </w:t>
+      </w:r>
+      <w:proofErr w:type="spellStart"/>
+      <w:r>
+        <w:rPr>
+          <w:b/>
+          <w:sz w:val="20"/>
+        </w:rPr>
+        <w:t>GovWorx</w:t>
+      </w:r>
+      <w:proofErr w:type="spellEnd"/>
+      <w:r>
+        <w:tab/>
+        <w:t>Jun 2026 – Present</w:t>
+      </w:r>
+    </w:p>
+    <w:p>
+      <w:pPr>
+        <w:spacing w:after="20" w:line="240" w:lineRule="auto"/>
+      </w:pPr>
+      <w:r>
+        <w:t xml:space="preserve">Stack: </w:t>
       </w:r>
       <w:r>
-        <w:t xml:space="preserve">  Jun 2026 – Present</w:t>
+        <w:t>.NET, C#, ASP.NET Core, Entity Framework Core, React, TypeScript</w:t>
+      </w:r>
+      <w:r>
+        <w:t>, SQL</w:t>
+      </w:r>
+      <w:r>
+        <w:t xml:space="preserve">, </w:t>
+      </w:r>
+      <w:proofErr w:type="spellStart"/>
+      <w:r>
+        <w:t>OpenTelemetry</w:t>
+      </w:r>
+      <w:proofErr w:type="spellEnd"/>
+      <w:r>
+        <w:t>, Datadog</w:t>
       </w:r>
     </w:p>
     <w:p>
@@ -117,7 +164,15 @@
         <w:spacing w:after="20" w:line="240" w:lineRule="auto"/>
       </w:pPr>
       <w:r>
-        <w:t>Contributed to GovWorxDataAgent, an on-premises .NET service that captures real-time 911 emergency-services data (calls, dispatch, and location) and streams it to a cloud AI platform.</w:t>
+        <w:t xml:space="preserve">Contributed to </w:t>
+      </w:r>
+      <w:proofErr w:type="spellStart"/>
+      <w:r>
+        <w:t>GovWorxDataAgent</w:t>
+      </w:r>
+      <w:proofErr w:type="spellEnd"/>
+      <w:r>
+        <w:t>, an on-premises .NET service that captures real-time 911 emergency-services data (calls, dispatch, and location) and streams it to a cloud AI platform.</w:t>
       </w:r>
     </w:p>
     <w:p>
@@ -126,7 +181,23 @@
         <w:spacing w:after="20" w:line="240" w:lineRule="auto"/>
       </w:pPr>
       <w:r>
-        <w:t>Designed and shipped three CAD (Computer-Aided Dispatch) connectors from scratch: Mark43 REST API connector, IMC connector over Actian Zen ODBC, and CentralSquare OneSolution XML connector. Owned the schema mapping, query logic, and configuration for each.</w:t>
+        <w:t xml:space="preserve">Designed and shipped three CAD (Computer-Aided Dispatch) connectors from scratch: Mark43 REST API connector, IMC connector over Actian Zen ODBC, and </w:t>
+      </w:r>
+      <w:proofErr w:type="spellStart"/>
+      <w:r>
+        <w:t>CentralSquare</w:t>
+      </w:r>
+      <w:proofErr w:type="spellEnd"/>
+      <w:r>
+        <w:t xml:space="preserve"> </w:t>
+      </w:r>
+      <w:proofErr w:type="spellStart"/>
+      <w:r>
+        <w:t>OneSolution</w:t>
+      </w:r>
+      <w:proofErr w:type="spellEnd"/>
+      <w:r>
+        <w:t xml:space="preserve"> XML connector. Owned the schema mapping, query logic, and configuration for each.</w:t>
       </w:r>
     </w:p>
     <w:p>
@@ -135,7 +206,15 @@
         <w:spacing w:after="20" w:line="240" w:lineRule="auto"/>
       </w:pPr>
       <w:r>
-        <w:t>Extended and hardened existing connectors for public-safety vendors (Tyler, Versaterm, Hexagon, and Spillman), working across SQL Server, Oracle, Informix, ODBC, REST, and XML data sources.</w:t>
+        <w:t xml:space="preserve">Extended and hardened existing connectors for public-safety vendors (Tyler, </w:t>
+      </w:r>
+      <w:proofErr w:type="spellStart"/>
+      <w:r>
+        <w:t>Versaterm</w:t>
+      </w:r>
+      <w:proofErr w:type="spellEnd"/>
+      <w:r>
+        <w:t>, Hexagon, and Spillman), working across SQL Server, Oracle, Informix, ODBC, REST, and XML data sources.</w:t>
       </w:r>
     </w:p>
     <w:p>
@@ -153,7 +232,24 @@
         <w:spacing w:after="20" w:line="240" w:lineRule="auto"/>
       </w:pPr>
       <w:r>
-        <w:t>Shipped 50+ Linear-tracked issues across 170+ commits through a reviewed pull-request workflow, covering backfill reliability, timezone-correctness fixes, and per-connector telemetry.</w:t>
+        <w:t xml:space="preserve">Shipped </w:t>
+      </w:r>
+      <w:r>
+        <w:rPr>
+          <w:b/>
+        </w:rPr>
+        <w:t>50+ Linear-tracked issues across 170+ commits</w:t>
+      </w:r>
+      <w:r>
+        <w:t xml:space="preserve"> through a reviewed pull-request workflow, covering backfill reliability, </w:t>
+      </w:r>
+      <w:proofErr w:type="spellStart"/>
+      <w:r>
+        <w:t>timezone</w:t>
+      </w:r>
+      <w:proofErr w:type="spellEnd"/>
+      <w:r>
+        <w:t>-correctness fixes, and per-connector telemetry.</w:t>
       </w:r>
     </w:p>
     <w:p>
@@ -162,11 +258,22 @@
         <w:spacing w:after="80" w:line="240" w:lineRule="auto"/>
       </w:pPr>
       <w:r>
-        <w:t>Built a full-stack connectivity and firewall-diagnostics tool with a React and TypeScript frontend and an ASP.NET Core API, instrumented with OpenTelemetry and Datadog metrics.</w:t>
+        <w:t xml:space="preserve">Built a full-stack connectivity and firewall-diagnostics tool with a React and TypeScript frontend and an ASP.NET Core API, instrumented with </w:t>
+      </w:r>
+      <w:proofErr w:type="spellStart"/>
+      <w:r>
+        <w:t>OpenTelemetry</w:t>
+      </w:r>
+      <w:proofErr w:type="spellEnd"/>
+      <w:r>
+        <w:t xml:space="preserve"> and Datadog metrics.</w:t>
       </w:r>
     </w:p>
     <w:p>
       <w:pPr>
+        <w:tabs>
+          <w:tab w:val="right" w:pos="10080"/>
+        </w:tabs>
         <w:spacing w:after="20" w:line="240" w:lineRule="auto"/>
       </w:pPr>
       <w:r>
@@ -177,7 +284,8 @@
         <w:t>Programmer &amp; Field Technician | VARSITY FIRST Robotics Team 2996</w:t>
       </w:r>
       <w:r>
-        <w:t xml:space="preserve">  Aug 2021 – May 2024</w:t>
+        <w:tab/>
+        <w:t>Aug 2021 – May 2024</w:t>
       </w:r>
     </w:p>
     <w:p>
@@ -192,7 +300,16 @@
         <w:t>for a</w:t>
       </w:r>
       <w:r>
-        <w:t xml:space="preserve"> team of 5, delivering fully functional competition robots within 6-week build cycles for 3 consecutive seasons, achieving 100% on-time delivery.</w:t>
+        <w:t xml:space="preserve"> team of 5, delivering fully functional competition robots within 6-week build cycles for 3 consecutive seasons, achieving </w:t>
+      </w:r>
+      <w:r>
+        <w:rPr>
+          <w:b/>
+        </w:rPr>
+        <w:t>100% on-time delivery</w:t>
+      </w:r>
+      <w:r>
+        <w:t>.</w:t>
       </w:r>
     </w:p>
     <w:p>
@@ -201,7 +318,24 @@
         <w:spacing w:after="120" w:line="240" w:lineRule="auto"/>
       </w:pPr>
       <w:r>
-        <w:t>Wrote 2,000+ lines of autonomous and teleoperated robot control code in Java using WPILib, achieving 9</w:t>
+        <w:t xml:space="preserve">Wrote </w:t>
+      </w:r>
+      <w:r>
+        <w:rPr>
+          <w:b/>
+        </w:rPr>
+        <w:t>2,000+ lines</w:t>
+      </w:r>
+      <w:r>
+        <w:t xml:space="preserve"> of autonomous and teleoperated robot control code in Java using </w:t>
+      </w:r>
+      <w:proofErr w:type="spellStart"/>
+      <w:r>
+        <w:t>WPILib</w:t>
+      </w:r>
+      <w:proofErr w:type="spellEnd"/>
+      <w:r>
+        <w:t>, achieving 9</w:t>
       </w:r>
       <w:r>
         <w:t>5</w:t>
@@ -239,6 +373,38 @@
           <w:b/>
           <w:sz w:val="20"/>
         </w:rPr>
+        <w:t>Accelerated Image Processing</w:t>
+      </w:r>
+      <w:r>
+        <w:t xml:space="preserve"> | OpenCL, C++17, GPU Computing, Image Processing</w:t>
+      </w:r>
+    </w:p>
+    <w:p>
+      <w:pPr>
+        <w:spacing w:after="60" w:line="240" w:lineRule="auto"/>
+      </w:pPr>
+      <w:r>
+        <w:t xml:space="preserve">GPU-accelerated image filter pipeline (grayscale, Gaussian blur, Sobel edge detection) in OpenCL, benchmarked against a scalar CPU baseline to achieve </w:t>
+      </w:r>
+      <w:r>
+        <w:rPr>
+          <w:b/>
+        </w:rPr>
+        <w:t>15–26x speedups</w:t>
+      </w:r>
+      <w:r>
+        <w:t xml:space="preserve"> on compute-bound filters.</w:t>
+      </w:r>
+    </w:p>
+    <w:p>
+      <w:pPr>
+        <w:spacing w:after="20" w:line="240" w:lineRule="auto"/>
+      </w:pPr>
+      <w:r>
+        <w:rPr>
+          <w:b/>
+          <w:sz w:val="20"/>
+        </w:rPr>
         <w:t>Clockless Mutex</w:t>
       </w:r>
       <w:r>
@@ -250,13 +416,35 @@
         <w:spacing w:after="60" w:line="240" w:lineRule="auto"/>
       </w:pPr>
       <w:r>
-        <w:t>Built from scratch a distributed mutual exclusion system implementing Lamport's 1978 logical clocks paper over unreliable message-passing networks. Designed layered C++17 architecture with thread-safe components (std::mutex, std::condition_variable, RAII) and chaos injection to verify correctness despite network delays and message reordering. Demonstrates causal ordering recovery and deadlock-free operation without shared clock or central coordinator.</w:t>
+        <w:t>Built from scratch a distributed mutual exclusion system implementing Lamport's 1978 logical clocks paper over unreliable message-passing networks. Designed layered C++17 architecture with thread-safe components (</w:t>
+      </w:r>
+      <w:proofErr w:type="gramStart"/>
+      <w:r>
+        <w:t>std::</w:t>
+      </w:r>
+      <w:proofErr w:type="gramEnd"/>
+      <w:r>
+        <w:t xml:space="preserve">mutex, </w:t>
+      </w:r>
+      <w:proofErr w:type="gramStart"/>
+      <w:r>
+        <w:t>std::</w:t>
+      </w:r>
+      <w:proofErr w:type="spellStart"/>
+      <w:proofErr w:type="gramEnd"/>
+      <w:r>
+        <w:t>condition_variable</w:t>
+      </w:r>
+      <w:proofErr w:type="spellEnd"/>
+      <w:r>
+        <w:t>, RAII) and chaos injection to verify correctness despite network delays and message reordering. Demonstrates causal ordering recovery and deadlock-free operation without shared clock or central coordinator.</w:t>
       </w:r>
     </w:p>
     <w:p>
       <w:pPr>
         <w:spacing w:after="20" w:line="240" w:lineRule="auto"/>
       </w:pPr>
+      <w:proofErr w:type="spellStart"/>
       <w:r>
         <w:rPr>
           <w:b/>
@@ -264,6 +452,7 @@
         </w:rPr>
         <w:t>Spotigang</w:t>
       </w:r>
+      <w:proofErr w:type="spellEnd"/>
       <w:r>
         <w:t xml:space="preserve"> | Node.js, Express, React, PostgreSQL, Spotify API</w:t>
       </w:r>
@@ -274,29 +463,6 @@
       </w:pPr>
       <w:r>
         <w:t>Full-stack music social feed with secure authentication, real-time Spotify API integration, and friend-sharing workflows. Deployed live on Render.</w:t>
-      </w:r>
-    </w:p>
-    <w:p>
-      <w:pPr>
-        <w:spacing w:after="20" w:line="240" w:lineRule="auto"/>
-      </w:pPr>
-      <w:r>
-        <w:rPr>
-          <w:b/>
-          <w:sz w:val="20"/>
-        </w:rPr>
-        <w:t>Vouch</w:t>
-      </w:r>
-      <w:r>
-        <w:t xml:space="preserve"> | Elixir, BEAM/OTP, TLS/PKI, Cryptography</w:t>
-      </w:r>
-    </w:p>
-    <w:p>
-      <w:pPr>
-        <w:spacing w:after="120" w:line="240" w:lineRule="auto"/>
-      </w:pPr>
-      <w:r>
-        <w:t>Open-source library composing end-to-end trust verification across reachability, TLS handshake, certificate pinning, and data integrity. Explores functional programming patterns and cryptographic systems design.</w:t>
       </w:r>
     </w:p>
     <w:p>
@@ -333,7 +499,10 @@
         <w:spacing w:after="120" w:line="240" w:lineRule="auto"/>
       </w:pPr>
       <w:r>
-        <w:t>Minor: Computer Engineering | GPA: 3.49</w:t>
+        <w:t>Minor: Computer Engineering | GPA: 3.4</w:t>
+      </w:r>
+      <w:r>
+        <w:t>4</w:t>
       </w:r>
     </w:p>
     <w:p>
@@ -377,7 +546,23 @@
         <w:t xml:space="preserve">Frameworks &amp; Tools: </w:t>
       </w:r>
       <w:r>
-        <w:t>React, Node.js, Express, .NET, ASP.NET Core, WPILib, Entity Framework Core, Docker, Git, PostgreSQL, SQL Server, OpenTelemetry, Datadog</w:t>
+        <w:t xml:space="preserve">React, Node.js, Express, .NET, ASP.NET Core, </w:t>
+      </w:r>
+      <w:proofErr w:type="spellStart"/>
+      <w:r>
+        <w:t>WPILib</w:t>
+      </w:r>
+      <w:proofErr w:type="spellEnd"/>
+      <w:r>
+        <w:t xml:space="preserve">, Entity Framework Core, Docker, Git, PostgreSQL, SQL Server, </w:t>
+      </w:r>
+      <w:proofErr w:type="spellStart"/>
+      <w:r>
+        <w:t>OpenTelemetry</w:t>
+      </w:r>
+      <w:proofErr w:type="spellEnd"/>
+      <w:r>
+        <w:t>, Datadog, OpenCL</w:t>
       </w:r>
     </w:p>
     <w:p>
@@ -392,7 +577,7 @@
         <w:t xml:space="preserve">Core Competencies: </w:t>
       </w:r>
       <w:r>
-        <w:t>Full-Stack Development, System Integration, Data Pipelines, Real-Time Systems, Distributed Algorithms, Agile Development</w:t>
+        <w:t>Full-Stack Development, System Integration, Data Pipelines, Real-Time Systems, Distributed Algorithms, Agile Development, GPU Computing, Parallel Programming</w:t>
       </w:r>
     </w:p>
     <w:sectPr>

</xml_diff>